<commit_message>
Corrige CVE-2025-66478 e dependencia xmldom
</commit_message>
<xml_diff>
--- a/lib/templates/lista_presenca.docx
+++ b/lib/templates/lista_presenca.docx
@@ -20,7 +20,7 @@
     <w:tbl>
       <w:tblPr>
         <w:tblStyle w:val="Table1"/>
-        <w:tblW w:w="10965.0" w:type="dxa"/>
+        <w:tblW w:w="10965" w:type="dxa"/>
         <w:jc w:val="left"/>
         <w:tblInd w:w="0" w:type="dxa"/>
         <w:tblBorders>
@@ -53,7 +53,7 @@
       <w:tr>
         <w:trPr>
           <w:cantSplit w:val="0"/>
-          <w:trHeight w:val="1020.472440944882" w:hRule="atLeast"/>
+          <w:trHeight w:val="1020" w:hRule="atLeast"/>
           <w:tblHeader w:val="0"/>
         </w:trPr>
         <w:tc>
@@ -68,7 +68,7 @@
                 <w:tab w:val="center" w:leader="none" w:pos="4513"/>
                 <w:tab w:val="right" w:leader="none" w:pos="9026"/>
               </w:tabs>
-              <w:ind w:left="-850.3937007874016" w:firstLine="0"/>
+              <w:ind w:left="-850" w:firstLine="0"/>
               <w:jc w:val="both"/>
               <w:rPr>
                 <w:color w:val="339966"/>
@@ -115,7 +115,7 @@
                 <w:tab w:val="center" w:leader="none" w:pos="4513"/>
                 <w:tab w:val="right" w:leader="none" w:pos="9026"/>
               </w:tabs>
-              <w:ind w:left="-850.3937007874016" w:firstLine="0"/>
+              <w:ind w:left="-850" w:firstLine="0"/>
               <w:jc w:val="both"/>
               <w:rPr>
                 <w:sz w:val="20"/>
@@ -201,7 +201,7 @@
       <w:tr>
         <w:trPr>
           <w:cantSplit w:val="0"/>
-          <w:trHeight w:val="283.46456692913387" w:hRule="atLeast"/>
+          <w:trHeight w:val="283" w:hRule="atLeast"/>
           <w:tblHeader w:val="0"/>
         </w:trPr>
         <w:tc>
@@ -333,7 +333,7 @@
           <w:p>
             <w:pPr>
               <w:widowControl w:val="1"/>
-              <w:ind w:right="261.1417322834649"/>
+              <w:ind w:right="261"/>
               <w:jc w:val="center"/>
               <w:rPr>
                 <w:i w:val="1"/>
@@ -370,7 +370,7 @@
           <w:tab w:val="right" w:leader="none" w:pos="9026"/>
         </w:tabs>
         <w:spacing w:line="60" w:lineRule="auto"/>
-        <w:ind w:left="-850.3937007874016" w:firstLine="0"/>
+        <w:ind w:left="-850" w:firstLine="0"/>
         <w:jc w:val="both"/>
         <w:rPr>
           <w:sz w:val="20"/>
@@ -386,7 +386,7 @@
     <w:tbl>
       <w:tblPr>
         <w:tblStyle w:val="Table2"/>
-        <w:tblW w:w="10980.0" w:type="dxa"/>
+        <w:tblW w:w="10980" w:type="dxa"/>
         <w:jc w:val="left"/>
         <w:tblBorders>
           <w:top w:color="000000" w:space="0" w:sz="0" w:val="nil"/>
@@ -436,10 +436,10 @@
               <w:right w:color="000000" w:space="0" w:sz="8" w:val="single"/>
             </w:tcBorders>
             <w:tcMar>
-              <w:top w:w="0.0" w:type="dxa"/>
-              <w:left w:w="40.0" w:type="dxa"/>
-              <w:bottom w:w="0.0" w:type="dxa"/>
-              <w:right w:w="40.0" w:type="dxa"/>
+              <w:top w:w="0" w:type="dxa"/>
+              <w:left w:w="40" w:type="dxa"/>
+              <w:bottom w:w="0" w:type="dxa"/>
+              <w:right w:w="40" w:type="dxa"/>
             </w:tcMar>
             <w:vAlign w:val="bottom"/>
           </w:tcPr>
@@ -478,10 +478,10 @@
               <w:right w:color="000000" w:space="0" w:sz="8" w:val="single"/>
             </w:tcBorders>
             <w:tcMar>
-              <w:top w:w="0.0" w:type="dxa"/>
-              <w:left w:w="40.0" w:type="dxa"/>
-              <w:bottom w:w="0.0" w:type="dxa"/>
-              <w:right w:w="40.0" w:type="dxa"/>
+              <w:top w:w="0" w:type="dxa"/>
+              <w:left w:w="40" w:type="dxa"/>
+              <w:bottom w:w="0" w:type="dxa"/>
+              <w:right w:w="40" w:type="dxa"/>
             </w:tcMar>
             <w:vAlign w:val="bottom"/>
           </w:tcPr>
@@ -514,10 +514,10 @@
               <w:right w:color="000000" w:space="0" w:sz="0" w:val="nil"/>
             </w:tcBorders>
             <w:tcMar>
-              <w:top w:w="0.0" w:type="dxa"/>
-              <w:left w:w="40.0" w:type="dxa"/>
-              <w:bottom w:w="0.0" w:type="dxa"/>
-              <w:right w:w="40.0" w:type="dxa"/>
+              <w:top w:w="0" w:type="dxa"/>
+              <w:left w:w="40" w:type="dxa"/>
+              <w:bottom w:w="0" w:type="dxa"/>
+              <w:right w:w="40" w:type="dxa"/>
             </w:tcMar>
             <w:vAlign w:val="center"/>
           </w:tcPr>
@@ -592,10 +592,10 @@
               <w:right w:color="000000" w:space="0" w:sz="0" w:val="nil"/>
             </w:tcBorders>
             <w:tcMar>
-              <w:top w:w="0.0" w:type="dxa"/>
-              <w:left w:w="40.0" w:type="dxa"/>
-              <w:bottom w:w="0.0" w:type="dxa"/>
-              <w:right w:w="40.0" w:type="dxa"/>
+              <w:top w:w="0" w:type="dxa"/>
+              <w:left w:w="40" w:type="dxa"/>
+              <w:bottom w:w="0" w:type="dxa"/>
+              <w:right w:w="40" w:type="dxa"/>
             </w:tcMar>
             <w:vAlign w:val="center"/>
           </w:tcPr>
@@ -676,10 +676,10 @@
               <w:right w:color="000000" w:space="0" w:sz="8" w:val="single"/>
             </w:tcBorders>
             <w:tcMar>
-              <w:top w:w="0.0" w:type="dxa"/>
-              <w:left w:w="40.0" w:type="dxa"/>
-              <w:bottom w:w="0.0" w:type="dxa"/>
-              <w:right w:w="40.0" w:type="dxa"/>
+              <w:top w:w="0" w:type="dxa"/>
+              <w:left w:w="40" w:type="dxa"/>
+              <w:bottom w:w="0" w:type="dxa"/>
+              <w:right w:w="40" w:type="dxa"/>
             </w:tcMar>
             <w:vAlign w:val="center"/>
           </w:tcPr>
@@ -719,10 +719,10 @@
               <w:right w:color="000000" w:space="0" w:sz="8" w:val="single"/>
             </w:tcBorders>
             <w:tcMar>
-              <w:top w:w="0.0" w:type="dxa"/>
-              <w:left w:w="40.0" w:type="dxa"/>
-              <w:bottom w:w="0.0" w:type="dxa"/>
-              <w:right w:w="40.0" w:type="dxa"/>
+              <w:top w:w="0" w:type="dxa"/>
+              <w:left w:w="40" w:type="dxa"/>
+              <w:bottom w:w="0" w:type="dxa"/>
+              <w:right w:w="40" w:type="dxa"/>
             </w:tcMar>
             <w:vAlign w:val="center"/>
           </w:tcPr>
@@ -821,10 +821,10 @@
               <w:right w:color="000000" w:space="0" w:sz="8" w:val="single"/>
             </w:tcBorders>
             <w:tcMar>
-              <w:top w:w="0.0" w:type="dxa"/>
-              <w:left w:w="40.0" w:type="dxa"/>
-              <w:bottom w:w="0.0" w:type="dxa"/>
-              <w:right w:w="40.0" w:type="dxa"/>
+              <w:top w:w="0" w:type="dxa"/>
+              <w:left w:w="40" w:type="dxa"/>
+              <w:bottom w:w="0" w:type="dxa"/>
+              <w:right w:w="40" w:type="dxa"/>
             </w:tcMar>
             <w:vAlign w:val="center"/>
           </w:tcPr>
@@ -922,10 +922,10 @@
               <w:right w:color="000000" w:space="0" w:sz="8" w:val="single"/>
             </w:tcBorders>
             <w:tcMar>
-              <w:top w:w="0.0" w:type="dxa"/>
-              <w:left w:w="40.0" w:type="dxa"/>
-              <w:bottom w:w="0.0" w:type="dxa"/>
-              <w:right w:w="40.0" w:type="dxa"/>
+              <w:top w:w="0" w:type="dxa"/>
+              <w:left w:w="40" w:type="dxa"/>
+              <w:bottom w:w="0" w:type="dxa"/>
+              <w:right w:w="40" w:type="dxa"/>
             </w:tcMar>
             <w:vAlign w:val="center"/>
           </w:tcPr>
@@ -983,7 +983,7 @@
       <w:tr>
         <w:trPr>
           <w:cantSplit w:val="0"/>
-          <w:trHeight w:val="283.46456692913387" w:hRule="atLeast"/>
+          <w:trHeight w:val="283" w:hRule="atLeast"/>
           <w:tblHeader w:val="0"/>
         </w:trPr>
         <w:tc>
@@ -995,10 +995,10 @@
               <w:right w:color="000000" w:space="0" w:sz="8" w:val="single"/>
             </w:tcBorders>
             <w:tcMar>
-              <w:top w:w="0.0" w:type="dxa"/>
-              <w:left w:w="40.0" w:type="dxa"/>
-              <w:bottom w:w="0.0" w:type="dxa"/>
-              <w:right w:w="40.0" w:type="dxa"/>
+              <w:top w:w="0" w:type="dxa"/>
+              <w:left w:w="40" w:type="dxa"/>
+              <w:bottom w:w="0" w:type="dxa"/>
+              <w:right w:w="40" w:type="dxa"/>
             </w:tcMar>
             <w:vAlign w:val="center"/>
           </w:tcPr>
@@ -1029,10 +1029,10 @@
               <w:right w:color="000000" w:space="0" w:sz="8" w:val="single"/>
             </w:tcBorders>
             <w:tcMar>
-              <w:top w:w="0.0" w:type="dxa"/>
-              <w:left w:w="40.0" w:type="dxa"/>
-              <w:bottom w:w="0.0" w:type="dxa"/>
-              <w:right w:w="40.0" w:type="dxa"/>
+              <w:top w:w="0" w:type="dxa"/>
+              <w:left w:w="40" w:type="dxa"/>
+              <w:bottom w:w="0" w:type="dxa"/>
+              <w:right w:w="40" w:type="dxa"/>
             </w:tcMar>
             <w:vAlign w:val="center"/>
           </w:tcPr>
@@ -1063,10 +1063,10 @@
               <w:right w:color="000000" w:space="0" w:sz="8" w:val="single"/>
             </w:tcBorders>
             <w:tcMar>
-              <w:top w:w="0.0" w:type="dxa"/>
-              <w:left w:w="40.0" w:type="dxa"/>
-              <w:bottom w:w="0.0" w:type="dxa"/>
-              <w:right w:w="40.0" w:type="dxa"/>
+              <w:top w:w="0" w:type="dxa"/>
+              <w:left w:w="40" w:type="dxa"/>
+              <w:bottom w:w="0" w:type="dxa"/>
+              <w:right w:w="40" w:type="dxa"/>
             </w:tcMar>
             <w:vAlign w:val="center"/>
           </w:tcPr>
@@ -1097,10 +1097,10 @@
               <w:right w:color="000000" w:space="0" w:sz="8" w:val="single"/>
             </w:tcBorders>
             <w:tcMar>
-              <w:top w:w="0.0" w:type="dxa"/>
-              <w:left w:w="40.0" w:type="dxa"/>
-              <w:bottom w:w="0.0" w:type="dxa"/>
-              <w:right w:w="40.0" w:type="dxa"/>
+              <w:top w:w="0" w:type="dxa"/>
+              <w:left w:w="40" w:type="dxa"/>
+              <w:bottom w:w="0" w:type="dxa"/>
+              <w:right w:w="40" w:type="dxa"/>
             </w:tcMar>
             <w:vAlign w:val="center"/>
           </w:tcPr>
@@ -1126,7 +1126,7 @@
       <w:tr>
         <w:trPr>
           <w:cantSplit w:val="0"/>
-          <w:trHeight w:val="283.46456692913387" w:hRule="atLeast"/>
+          <w:trHeight w:val="283" w:hRule="atLeast"/>
           <w:tblHeader w:val="0"/>
         </w:trPr>
         <w:tc>
@@ -1138,10 +1138,10 @@
               <w:right w:color="000000" w:space="0" w:sz="8" w:val="single"/>
             </w:tcBorders>
             <w:tcMar>
-              <w:top w:w="0.0" w:type="dxa"/>
-              <w:left w:w="40.0" w:type="dxa"/>
-              <w:bottom w:w="0.0" w:type="dxa"/>
-              <w:right w:w="40.0" w:type="dxa"/>
+              <w:top w:w="0" w:type="dxa"/>
+              <w:left w:w="40" w:type="dxa"/>
+              <w:bottom w:w="0" w:type="dxa"/>
+              <w:right w:w="40" w:type="dxa"/>
             </w:tcMar>
             <w:vAlign w:val="center"/>
           </w:tcPr>
@@ -1170,72 +1170,72 @@
               <w:right w:color="000000" w:space="0" w:sz="8" w:val="single"/>
             </w:tcBorders>
             <w:tcMar>
-              <w:top w:w="0.0" w:type="dxa"/>
-              <w:left w:w="40.0" w:type="dxa"/>
-              <w:bottom w:w="0.0" w:type="dxa"/>
-              <w:right w:w="40.0" w:type="dxa"/>
-            </w:tcMar>
-            <w:vAlign w:val="center"/>
-          </w:tcPr>
-          <w:p>
-            <w:pPr>
-              <w:spacing w:line="276" w:lineRule="auto"/>
-              <w:rPr>
-                <w:sz w:val="20"/>
-                <w:szCs w:val="20"/>
-              </w:rPr>
-            </w:pPr>
-            <w:r>
-              <w:rPr>
-                <w:rtl w:val="0"/>
-              </w:rPr>
-            </w:r>
-          </w:p>
-        </w:tc>
-        <w:tc>
-          <w:tcPr>
-            <w:tcBorders>
-              <w:top w:color="000000" w:space="0" w:sz="8" w:val="single"/>
-              <w:left w:color="000000" w:space="0" w:sz="8" w:val="single"/>
-              <w:bottom w:color="000000" w:space="0" w:sz="8" w:val="single"/>
-              <w:right w:color="000000" w:space="0" w:sz="8" w:val="single"/>
-            </w:tcBorders>
-            <w:tcMar>
-              <w:top w:w="0.0" w:type="dxa"/>
-              <w:left w:w="40.0" w:type="dxa"/>
-              <w:bottom w:w="0.0" w:type="dxa"/>
-              <w:right w:w="40.0" w:type="dxa"/>
-            </w:tcMar>
-            <w:vAlign w:val="center"/>
-          </w:tcPr>
-          <w:p>
-            <w:pPr>
-              <w:spacing w:line="276" w:lineRule="auto"/>
-              <w:rPr>
-                <w:sz w:val="20"/>
-                <w:szCs w:val="20"/>
-              </w:rPr>
-            </w:pPr>
-            <w:r>
-              <w:rPr>
-                <w:rtl w:val="0"/>
-              </w:rPr>
-            </w:r>
-          </w:p>
-        </w:tc>
-        <w:tc>
-          <w:tcPr>
-            <w:tcBorders>
-              <w:top w:color="000000" w:space="0" w:sz="8" w:val="single"/>
-              <w:left w:color="000000" w:space="0" w:sz="8" w:val="single"/>
-              <w:bottom w:color="000000" w:space="0" w:sz="8" w:val="single"/>
-              <w:right w:color="000000" w:space="0" w:sz="8" w:val="single"/>
-            </w:tcBorders>
-            <w:tcMar>
-              <w:top w:w="0.0" w:type="dxa"/>
-              <w:left w:w="40.0" w:type="dxa"/>
-              <w:bottom w:w="0.0" w:type="dxa"/>
-              <w:right w:w="40.0" w:type="dxa"/>
+              <w:top w:w="0" w:type="dxa"/>
+              <w:left w:w="40" w:type="dxa"/>
+              <w:bottom w:w="0" w:type="dxa"/>
+              <w:right w:w="40" w:type="dxa"/>
+            </w:tcMar>
+            <w:vAlign w:val="center"/>
+          </w:tcPr>
+          <w:p>
+            <w:pPr>
+              <w:spacing w:line="276" w:lineRule="auto"/>
+              <w:rPr>
+                <w:sz w:val="20"/>
+                <w:szCs w:val="20"/>
+              </w:rPr>
+            </w:pPr>
+            <w:r>
+              <w:rPr>
+                <w:rtl w:val="0"/>
+              </w:rPr>
+            </w:r>
+          </w:p>
+        </w:tc>
+        <w:tc>
+          <w:tcPr>
+            <w:tcBorders>
+              <w:top w:color="000000" w:space="0" w:sz="8" w:val="single"/>
+              <w:left w:color="000000" w:space="0" w:sz="8" w:val="single"/>
+              <w:bottom w:color="000000" w:space="0" w:sz="8" w:val="single"/>
+              <w:right w:color="000000" w:space="0" w:sz="8" w:val="single"/>
+            </w:tcBorders>
+            <w:tcMar>
+              <w:top w:w="0" w:type="dxa"/>
+              <w:left w:w="40" w:type="dxa"/>
+              <w:bottom w:w="0" w:type="dxa"/>
+              <w:right w:w="40" w:type="dxa"/>
+            </w:tcMar>
+            <w:vAlign w:val="center"/>
+          </w:tcPr>
+          <w:p>
+            <w:pPr>
+              <w:spacing w:line="276" w:lineRule="auto"/>
+              <w:rPr>
+                <w:sz w:val="20"/>
+                <w:szCs w:val="20"/>
+              </w:rPr>
+            </w:pPr>
+            <w:r>
+              <w:rPr>
+                <w:rtl w:val="0"/>
+              </w:rPr>
+            </w:r>
+          </w:p>
+        </w:tc>
+        <w:tc>
+          <w:tcPr>
+            <w:tcBorders>
+              <w:top w:color="000000" w:space="0" w:sz="8" w:val="single"/>
+              <w:left w:color="000000" w:space="0" w:sz="8" w:val="single"/>
+              <w:bottom w:color="000000" w:space="0" w:sz="8" w:val="single"/>
+              <w:right w:color="000000" w:space="0" w:sz="8" w:val="single"/>
+            </w:tcBorders>
+            <w:tcMar>
+              <w:top w:w="0" w:type="dxa"/>
+              <w:left w:w="40" w:type="dxa"/>
+              <w:bottom w:w="0" w:type="dxa"/>
+              <w:right w:w="40" w:type="dxa"/>
             </w:tcMar>
             <w:vAlign w:val="center"/>
           </w:tcPr>
@@ -1258,7 +1258,7 @@
       <w:tr>
         <w:trPr>
           <w:cantSplit w:val="0"/>
-          <w:trHeight w:val="283.46456692913387" w:hRule="atLeast"/>
+          <w:trHeight w:val="283" w:hRule="atLeast"/>
           <w:tblHeader w:val="0"/>
         </w:trPr>
         <w:tc>
@@ -1270,10 +1270,10 @@
               <w:right w:color="000000" w:space="0" w:sz="8" w:val="single"/>
             </w:tcBorders>
             <w:tcMar>
-              <w:top w:w="0.0" w:type="dxa"/>
-              <w:left w:w="40.0" w:type="dxa"/>
-              <w:bottom w:w="0.0" w:type="dxa"/>
-              <w:right w:w="40.0" w:type="dxa"/>
+              <w:top w:w="0" w:type="dxa"/>
+              <w:left w:w="40" w:type="dxa"/>
+              <w:bottom w:w="0" w:type="dxa"/>
+              <w:right w:w="40" w:type="dxa"/>
             </w:tcMar>
             <w:vAlign w:val="center"/>
           </w:tcPr>
@@ -1302,72 +1302,72 @@
               <w:right w:color="000000" w:space="0" w:sz="8" w:val="single"/>
             </w:tcBorders>
             <w:tcMar>
-              <w:top w:w="0.0" w:type="dxa"/>
-              <w:left w:w="40.0" w:type="dxa"/>
-              <w:bottom w:w="0.0" w:type="dxa"/>
-              <w:right w:w="40.0" w:type="dxa"/>
-            </w:tcMar>
-            <w:vAlign w:val="center"/>
-          </w:tcPr>
-          <w:p>
-            <w:pPr>
-              <w:spacing w:line="276" w:lineRule="auto"/>
-              <w:rPr>
-                <w:sz w:val="20"/>
-                <w:szCs w:val="20"/>
-              </w:rPr>
-            </w:pPr>
-            <w:r>
-              <w:rPr>
-                <w:rtl w:val="0"/>
-              </w:rPr>
-            </w:r>
-          </w:p>
-        </w:tc>
-        <w:tc>
-          <w:tcPr>
-            <w:tcBorders>
-              <w:top w:color="000000" w:space="0" w:sz="8" w:val="single"/>
-              <w:left w:color="000000" w:space="0" w:sz="8" w:val="single"/>
-              <w:bottom w:color="000000" w:space="0" w:sz="8" w:val="single"/>
-              <w:right w:color="000000" w:space="0" w:sz="8" w:val="single"/>
-            </w:tcBorders>
-            <w:tcMar>
-              <w:top w:w="0.0" w:type="dxa"/>
-              <w:left w:w="40.0" w:type="dxa"/>
-              <w:bottom w:w="0.0" w:type="dxa"/>
-              <w:right w:w="40.0" w:type="dxa"/>
-            </w:tcMar>
-            <w:vAlign w:val="center"/>
-          </w:tcPr>
-          <w:p>
-            <w:pPr>
-              <w:spacing w:line="276" w:lineRule="auto"/>
-              <w:rPr>
-                <w:sz w:val="20"/>
-                <w:szCs w:val="20"/>
-              </w:rPr>
-            </w:pPr>
-            <w:r>
-              <w:rPr>
-                <w:rtl w:val="0"/>
-              </w:rPr>
-            </w:r>
-          </w:p>
-        </w:tc>
-        <w:tc>
-          <w:tcPr>
-            <w:tcBorders>
-              <w:top w:color="000000" w:space="0" w:sz="8" w:val="single"/>
-              <w:left w:color="000000" w:space="0" w:sz="8" w:val="single"/>
-              <w:bottom w:color="000000" w:space="0" w:sz="8" w:val="single"/>
-              <w:right w:color="000000" w:space="0" w:sz="8" w:val="single"/>
-            </w:tcBorders>
-            <w:tcMar>
-              <w:top w:w="0.0" w:type="dxa"/>
-              <w:left w:w="40.0" w:type="dxa"/>
-              <w:bottom w:w="0.0" w:type="dxa"/>
-              <w:right w:w="40.0" w:type="dxa"/>
+              <w:top w:w="0" w:type="dxa"/>
+              <w:left w:w="40" w:type="dxa"/>
+              <w:bottom w:w="0" w:type="dxa"/>
+              <w:right w:w="40" w:type="dxa"/>
+            </w:tcMar>
+            <w:vAlign w:val="center"/>
+          </w:tcPr>
+          <w:p>
+            <w:pPr>
+              <w:spacing w:line="276" w:lineRule="auto"/>
+              <w:rPr>
+                <w:sz w:val="20"/>
+                <w:szCs w:val="20"/>
+              </w:rPr>
+            </w:pPr>
+            <w:r>
+              <w:rPr>
+                <w:rtl w:val="0"/>
+              </w:rPr>
+            </w:r>
+          </w:p>
+        </w:tc>
+        <w:tc>
+          <w:tcPr>
+            <w:tcBorders>
+              <w:top w:color="000000" w:space="0" w:sz="8" w:val="single"/>
+              <w:left w:color="000000" w:space="0" w:sz="8" w:val="single"/>
+              <w:bottom w:color="000000" w:space="0" w:sz="8" w:val="single"/>
+              <w:right w:color="000000" w:space="0" w:sz="8" w:val="single"/>
+            </w:tcBorders>
+            <w:tcMar>
+              <w:top w:w="0" w:type="dxa"/>
+              <w:left w:w="40" w:type="dxa"/>
+              <w:bottom w:w="0" w:type="dxa"/>
+              <w:right w:w="40" w:type="dxa"/>
+            </w:tcMar>
+            <w:vAlign w:val="center"/>
+          </w:tcPr>
+          <w:p>
+            <w:pPr>
+              <w:spacing w:line="276" w:lineRule="auto"/>
+              <w:rPr>
+                <w:sz w:val="20"/>
+                <w:szCs w:val="20"/>
+              </w:rPr>
+            </w:pPr>
+            <w:r>
+              <w:rPr>
+                <w:rtl w:val="0"/>
+              </w:rPr>
+            </w:r>
+          </w:p>
+        </w:tc>
+        <w:tc>
+          <w:tcPr>
+            <w:tcBorders>
+              <w:top w:color="000000" w:space="0" w:sz="8" w:val="single"/>
+              <w:left w:color="000000" w:space="0" w:sz="8" w:val="single"/>
+              <w:bottom w:color="000000" w:space="0" w:sz="8" w:val="single"/>
+              <w:right w:color="000000" w:space="0" w:sz="8" w:val="single"/>
+            </w:tcBorders>
+            <w:tcMar>
+              <w:top w:w="0" w:type="dxa"/>
+              <w:left w:w="40" w:type="dxa"/>
+              <w:bottom w:w="0" w:type="dxa"/>
+              <w:right w:w="40" w:type="dxa"/>
             </w:tcMar>
             <w:vAlign w:val="center"/>
           </w:tcPr>
@@ -1399,10 +1399,10 @@
               <w:right w:color="000000" w:space="0" w:sz="0" w:val="nil"/>
             </w:tcBorders>
             <w:tcMar>
-              <w:top w:w="0.0" w:type="dxa"/>
-              <w:left w:w="40.0" w:type="dxa"/>
-              <w:bottom w:w="0.0" w:type="dxa"/>
-              <w:right w:w="40.0" w:type="dxa"/>
+              <w:top w:w="0" w:type="dxa"/>
+              <w:left w:w="40" w:type="dxa"/>
+              <w:bottom w:w="0" w:type="dxa"/>
+              <w:right w:w="40" w:type="dxa"/>
             </w:tcMar>
             <w:vAlign w:val="center"/>
           </w:tcPr>
@@ -1430,10 +1430,10 @@
               <w:right w:color="000000" w:space="0" w:sz="0" w:val="nil"/>
             </w:tcBorders>
             <w:tcMar>
-              <w:top w:w="0.0" w:type="dxa"/>
-              <w:left w:w="40.0" w:type="dxa"/>
-              <w:bottom w:w="0.0" w:type="dxa"/>
-              <w:right w:w="40.0" w:type="dxa"/>
+              <w:top w:w="0" w:type="dxa"/>
+              <w:left w:w="40" w:type="dxa"/>
+              <w:bottom w:w="0" w:type="dxa"/>
+              <w:right w:w="40" w:type="dxa"/>
             </w:tcMar>
             <w:vAlign w:val="bottom"/>
           </w:tcPr>
@@ -1469,10 +1469,10 @@
               <w:right w:color="000000" w:space="0" w:sz="8" w:val="single"/>
             </w:tcBorders>
             <w:tcMar>
-              <w:top w:w="0.0" w:type="dxa"/>
-              <w:left w:w="40.0" w:type="dxa"/>
-              <w:bottom w:w="0.0" w:type="dxa"/>
-              <w:right w:w="40.0" w:type="dxa"/>
+              <w:top w:w="0" w:type="dxa"/>
+              <w:left w:w="40" w:type="dxa"/>
+              <w:bottom w:w="0" w:type="dxa"/>
+              <w:right w:w="40" w:type="dxa"/>
             </w:tcMar>
             <w:vAlign w:val="center"/>
           </w:tcPr>
@@ -1543,10 +1543,10 @@
               <w:right w:color="000000" w:space="0" w:sz="8" w:val="single"/>
             </w:tcBorders>
             <w:tcMar>
-              <w:top w:w="0.0" w:type="dxa"/>
-              <w:left w:w="40.0" w:type="dxa"/>
-              <w:bottom w:w="0.0" w:type="dxa"/>
-              <w:right w:w="40.0" w:type="dxa"/>
+              <w:top w:w="0" w:type="dxa"/>
+              <w:left w:w="40" w:type="dxa"/>
+              <w:bottom w:w="0" w:type="dxa"/>
+              <w:right w:w="40" w:type="dxa"/>
             </w:tcMar>
             <w:vAlign w:val="center"/>
           </w:tcPr>
@@ -1610,10 +1610,10 @@
               <w:right w:color="000000" w:space="0" w:sz="8" w:val="single"/>
             </w:tcBorders>
             <w:tcMar>
-              <w:top w:w="0.0" w:type="dxa"/>
-              <w:left w:w="40.0" w:type="dxa"/>
-              <w:bottom w:w="0.0" w:type="dxa"/>
-              <w:right w:w="40.0" w:type="dxa"/>
+              <w:top w:w="0" w:type="dxa"/>
+              <w:left w:w="40" w:type="dxa"/>
+              <w:bottom w:w="0" w:type="dxa"/>
+              <w:right w:w="40" w:type="dxa"/>
             </w:tcMar>
             <w:vAlign w:val="center"/>
           </w:tcPr>
@@ -1676,10 +1676,10 @@
               <w:right w:color="000000" w:space="0" w:sz="8" w:val="single"/>
             </w:tcBorders>
             <w:tcMar>
-              <w:top w:w="0.0" w:type="dxa"/>
-              <w:left w:w="40.0" w:type="dxa"/>
-              <w:bottom w:w="0.0" w:type="dxa"/>
-              <w:right w:w="40.0" w:type="dxa"/>
+              <w:top w:w="0" w:type="dxa"/>
+              <w:left w:w="40" w:type="dxa"/>
+              <w:bottom w:w="0" w:type="dxa"/>
+              <w:right w:w="40" w:type="dxa"/>
             </w:tcMar>
             <w:vAlign w:val="center"/>
           </w:tcPr>
@@ -1743,10 +1743,10 @@
               <w:right w:color="000000" w:space="0" w:sz="8" w:val="single"/>
             </w:tcBorders>
             <w:tcMar>
-              <w:top w:w="0.0" w:type="dxa"/>
-              <w:left w:w="40.0" w:type="dxa"/>
-              <w:bottom w:w="0.0" w:type="dxa"/>
-              <w:right w:w="40.0" w:type="dxa"/>
+              <w:top w:w="0" w:type="dxa"/>
+              <w:left w:w="40" w:type="dxa"/>
+              <w:bottom w:w="0" w:type="dxa"/>
+              <w:right w:w="40" w:type="dxa"/>
             </w:tcMar>
             <w:vAlign w:val="center"/>
           </w:tcPr>
@@ -1804,7 +1804,7 @@
       <w:tr>
         <w:trPr>
           <w:cantSplit w:val="1"/>
-          <w:trHeight w:val="283.46456692913387" w:hRule="atLeast"/>
+          <w:trHeight w:val="283" w:hRule="atLeast"/>
           <w:tblHeader w:val="0"/>
         </w:trPr>
         <w:tc>
@@ -1817,10 +1817,10 @@
               <w:right w:color="000000" w:space="0" w:sz="8" w:val="single"/>
             </w:tcBorders>
             <w:tcMar>
-              <w:top w:w="0.0" w:type="dxa"/>
-              <w:left w:w="40.0" w:type="dxa"/>
-              <w:bottom w:w="0.0" w:type="dxa"/>
-              <w:right w:w="40.0" w:type="dxa"/>
+              <w:top w:w="0" w:type="dxa"/>
+              <w:left w:w="40" w:type="dxa"/>
+              <w:bottom w:w="0" w:type="dxa"/>
+              <w:right w:w="40" w:type="dxa"/>
             </w:tcMar>
             <w:vAlign w:val="center"/>
           </w:tcPr>
@@ -1867,10 +1867,10 @@
               <w:right w:color="000000" w:space="0" w:sz="8" w:val="single"/>
             </w:tcBorders>
             <w:tcMar>
-              <w:top w:w="0.0" w:type="dxa"/>
-              <w:left w:w="40.0" w:type="dxa"/>
-              <w:bottom w:w="0.0" w:type="dxa"/>
-              <w:right w:w="40.0" w:type="dxa"/>
+              <w:top w:w="0" w:type="dxa"/>
+              <w:left w:w="40" w:type="dxa"/>
+              <w:bottom w:w="0" w:type="dxa"/>
+              <w:right w:w="40" w:type="dxa"/>
             </w:tcMar>
             <w:vAlign w:val="center"/>
           </w:tcPr>
@@ -1900,10 +1900,10 @@
               <w:right w:color="000000" w:space="0" w:sz="8" w:val="single"/>
             </w:tcBorders>
             <w:tcMar>
-              <w:top w:w="0.0" w:type="dxa"/>
-              <w:left w:w="40.0" w:type="dxa"/>
-              <w:bottom w:w="0.0" w:type="dxa"/>
-              <w:right w:w="40.0" w:type="dxa"/>
+              <w:top w:w="0" w:type="dxa"/>
+              <w:left w:w="40" w:type="dxa"/>
+              <w:bottom w:w="0" w:type="dxa"/>
+              <w:right w:w="40" w:type="dxa"/>
             </w:tcMar>
             <w:vAlign w:val="center"/>
           </w:tcPr>
@@ -1934,10 +1934,10 @@
               <w:right w:color="000000" w:space="0" w:sz="8" w:val="single"/>
             </w:tcBorders>
             <w:tcMar>
-              <w:top w:w="0.0" w:type="dxa"/>
-              <w:left w:w="40.0" w:type="dxa"/>
-              <w:bottom w:w="0.0" w:type="dxa"/>
-              <w:right w:w="40.0" w:type="dxa"/>
+              <w:top w:w="0" w:type="dxa"/>
+              <w:left w:w="40" w:type="dxa"/>
+              <w:bottom w:w="0" w:type="dxa"/>
+              <w:right w:w="40" w:type="dxa"/>
             </w:tcMar>
             <w:vAlign w:val="center"/>
           </w:tcPr>
@@ -2014,7 +2014,7 @@
     </w:p>
     <w:sectPr>
       <w:pgSz w:h="16838" w:w="11906" w:orient="portrait"/>
-      <w:pgMar w:bottom="142" w:top="142" w:left="400" w:right="400" w:header="0" w:footer="720"/>
+      <w:pgMar w:bottom="142" w:top="142" w:left="400" w:right="400" w:header="0" w:footer="720" w:gutter="0"/>
       <w:pgNumType w:start="1"/>
     </w:sectPr>
   </w:body>
@@ -2068,7 +2068,7 @@
         <w:between w:space="0" w:sz="0" w:val="nil"/>
       </w:pBdr>
       <w:shd w:fill="auto" w:val="clear"/>
-      <w:spacing w:after="360" w:before="640" w:line="275.9999942779541" w:lineRule="auto"/>
+      <w:spacing w:after="360" w:before="640" w:line="276" w:lineRule="auto"/>
     </w:pPr>
     <w:rPr>
       <w:rFonts w:ascii="Arial" w:cs="Arial" w:eastAsia="Arial" w:hAnsi="Arial"/>
@@ -2094,7 +2094,7 @@
         <w:between w:space="0" w:sz="0" w:val="nil"/>
       </w:pBdr>
       <w:shd w:fill="auto" w:val="clear"/>
-      <w:spacing w:after="345" w:before="585" w:line="275.9999942779541" w:lineRule="auto"/>
+      <w:spacing w:after="345" w:before="585" w:line="276" w:lineRule="auto"/>
     </w:pPr>
     <w:rPr>
       <w:rFonts w:ascii="Arial" w:cs="Arial" w:eastAsia="Arial" w:hAnsi="Arial"/>
@@ -2120,7 +2120,7 @@
         <w:between w:space="0" w:sz="0" w:val="nil"/>
       </w:pBdr>
       <w:shd w:fill="auto" w:val="clear"/>
-      <w:spacing w:after="320" w:before="560" w:line="275.9999942779541" w:lineRule="auto"/>
+      <w:spacing w:after="320" w:before="560" w:line="276" w:lineRule="auto"/>
     </w:pPr>
     <w:rPr>
       <w:rFonts w:ascii="Arial" w:cs="Arial" w:eastAsia="Arial" w:hAnsi="Arial"/>
@@ -2146,7 +2146,7 @@
         <w:between w:space="0" w:sz="0" w:val="nil"/>
       </w:pBdr>
       <w:shd w:fill="auto" w:val="clear"/>
-      <w:spacing w:after="335" w:before="535" w:line="275.9999942779541" w:lineRule="auto"/>
+      <w:spacing w:after="335" w:before="535" w:line="276" w:lineRule="auto"/>
     </w:pPr>
     <w:rPr>
       <w:rFonts w:ascii="Arial" w:cs="Arial" w:eastAsia="Arial" w:hAnsi="Arial"/>
@@ -2172,7 +2172,7 @@
         <w:between w:space="0" w:sz="0" w:val="nil"/>
       </w:pBdr>
       <w:shd w:fill="auto" w:val="clear"/>
-      <w:spacing w:after="335" w:before="495" w:line="275.9999942779541" w:lineRule="auto"/>
+      <w:spacing w:after="335" w:before="495" w:line="276" w:lineRule="auto"/>
     </w:pPr>
     <w:rPr>
       <w:rFonts w:ascii="Arial" w:cs="Arial" w:eastAsia="Arial" w:hAnsi="Arial"/>
@@ -2198,7 +2198,7 @@
         <w:between w:space="0" w:sz="0" w:val="nil"/>
       </w:pBdr>
       <w:shd w:fill="auto" w:val="clear"/>
-      <w:spacing w:after="440" w:before="600" w:line="275.9999942779541" w:lineRule="auto"/>
+      <w:spacing w:after="440" w:before="600" w:line="276" w:lineRule="auto"/>
     </w:pPr>
     <w:rPr>
       <w:rFonts w:ascii="Arial" w:cs="Arial" w:eastAsia="Arial" w:hAnsi="Arial"/>

</xml_diff>